<commit_message>
docs: ajusta titulo no Execucao_Trabalho_Final
</commit_message>
<xml_diff>
--- a/Trabalho-Final/evidencias/Execucao_Trabalho_Final.docx
+++ b/Trabalho-Final/evidencias/Execucao_Trabalho_Final.docx
@@ -433,6 +433,7 @@
       </w:r>
       <w:r>
         <w:rPr>
+          <w:noProof/>
           <w:lang w:val="pt-BR"/>
         </w:rPr>
         <w:drawing>
@@ -609,6 +610,9 @@
     <w:p/>
     <w:p>
       <w:r>
+        <w:rPr>
+          <w:noProof/>
+        </w:rPr>
         <w:drawing>
           <wp:inline distT="0" distB="0" distL="0" distR="0" wp14:anchorId="442C8ED3" wp14:editId="5B30BFB6">
             <wp:extent cx="5486400" cy="3328670"/>
@@ -648,6 +652,9 @@
     </w:p>
     <w:p>
       <w:r>
+        <w:rPr>
+          <w:noProof/>
+        </w:rPr>
         <w:drawing>
           <wp:inline distT="0" distB="0" distL="0" distR="0" wp14:anchorId="51F3CB14" wp14:editId="736B363F">
             <wp:extent cx="5486400" cy="2000250"/>
@@ -696,19 +703,7 @@
         <w:rPr>
           <w:lang w:val="pt-BR"/>
         </w:rPr>
-        <w:t xml:space="preserve">Tarefa </w:t>
-      </w:r>
-      <w:r>
-        <w:rPr>
-          <w:lang w:val="pt-BR"/>
-        </w:rPr>
-        <w:t>5</w:t>
-      </w:r>
-      <w:r>
-        <w:rPr>
-          <w:lang w:val="pt-BR"/>
-        </w:rPr>
-        <w:t xml:space="preserve"> - Adicionar coluna calculada valor_final</w:t>
+        <w:t>Tarefa 5 - Adicionar coluna calculada valor_final</w:t>
       </w:r>
     </w:p>
     <w:p>
@@ -726,6 +721,7 @@
       </w:pPr>
       <w:r>
         <w:rPr>
+          <w:noProof/>
           <w:lang w:val="pt-BR"/>
         </w:rPr>
         <w:lastRenderedPageBreak/>
@@ -775,6 +771,9 @@
     </w:p>
     <w:p>
       <w:r>
+        <w:rPr>
+          <w:noProof/>
+        </w:rPr>
         <w:drawing>
           <wp:inline distT="0" distB="0" distL="0" distR="0" wp14:anchorId="10663C6C" wp14:editId="6D83262F">
             <wp:extent cx="5486400" cy="1759585"/>
@@ -814,6 +813,9 @@
     </w:p>
     <w:p>
       <w:r>
+        <w:rPr>
+          <w:noProof/>
+        </w:rPr>
         <w:drawing>
           <wp:inline distT="0" distB="0" distL="0" distR="0" wp14:anchorId="5668665A" wp14:editId="1BE63AE8">
             <wp:extent cx="5486400" cy="2157730"/>
@@ -853,6 +855,9 @@
     </w:p>
     <w:p>
       <w:r>
+        <w:rPr>
+          <w:noProof/>
+        </w:rPr>
         <w:drawing>
           <wp:inline distT="0" distB="0" distL="0" distR="0" wp14:anchorId="362E9312" wp14:editId="73AC9A12">
             <wp:extent cx="5486400" cy="1468120"/>
@@ -932,6 +937,7 @@
       </w:pPr>
       <w:r>
         <w:rPr>
+          <w:noProof/>
           <w:lang w:val="pt-BR"/>
         </w:rPr>
         <w:drawing>
@@ -979,6 +985,7 @@
       </w:pPr>
       <w:r>
         <w:rPr>
+          <w:noProof/>
           <w:lang w:val="pt-BR"/>
         </w:rPr>
         <w:lastRenderedPageBreak/>
@@ -1027,6 +1034,7 @@
       </w:pPr>
       <w:r>
         <w:rPr>
+          <w:noProof/>
           <w:lang w:val="pt-BR"/>
         </w:rPr>
         <w:drawing>
@@ -1074,6 +1082,7 @@
       </w:pPr>
       <w:r>
         <w:rPr>
+          <w:noProof/>
           <w:lang w:val="pt-BR"/>
         </w:rPr>
         <w:lastRenderedPageBreak/>
@@ -1161,6 +1170,7 @@
       </w:pPr>
       <w:r>
         <w:rPr>
+          <w:noProof/>
           <w:lang w:val="pt-BR"/>
         </w:rPr>
         <w:drawing>
@@ -1229,7 +1239,7 @@
         <w:rPr>
           <w:lang w:val="pt-BR"/>
         </w:rPr>
-        <w:t>Otimização da tabela pedidos_iceberg</w:t>
+        <w:t>Query executiva dos Top 5 clientes</w:t>
       </w:r>
     </w:p>
     <w:p>
@@ -1240,6 +1250,7 @@
       </w:pPr>
       <w:r>
         <w:rPr>
+          <w:noProof/>
           <w:lang w:val="pt-BR"/>
         </w:rPr>
         <w:drawing>

</xml_diff>